<commit_message>
Recria Ads: bônus com ancoragem de valor (R$ 738) e bônus surpresa
Co-Authored-By: Claude Opus 5.5 <noreply@anthropic.com>
Claude-Session: https://claude.ai/code/session_01RDM8d5cVD9w4uwiMSyLkgt
</commit_message>
<xml_diff>
--- a/agencia-recria/cursos/recria-ads/para-ler-e-gravar/Video de vendas e pagina de vendas.docx
+++ b/agencia-recria/cursos/recria-ads/para-ler-e-gravar/Video de vendas e pagina de vendas.docx
@@ -551,7 +551,7 @@
           <w:b/>
           <w:color w:val="5A4412"/>
         </w:rPr>
-        <w:t>Bônus:</w:t>
+        <w:t>Bônus exclusivos (com ancoragem de valor):</w:t>
       </w:r>
     </w:p>
     <w:p>
@@ -559,7 +559,7 @@
         <w:pStyle w:val="ListBullet"/>
       </w:pPr>
       <w:r>
-        <w:t>🎁 prompt "Meu mês de conteúdo" (30 ideias no primeiro dia)</w:t>
+        <w:t>🎁 Prompt "Meu mês de conteúdo" (30 ideias no primeiro dia): valor R$ 197</w:t>
       </w:r>
     </w:p>
     <w:p>
@@ -567,7 +567,7 @@
         <w:pStyle w:val="ListBullet"/>
       </w:pPr>
       <w:r>
-        <w:t>📚 Acervo Recria</w:t>
+        <w:t>📚 Acervo Recria: valor R$ 297</w:t>
       </w:r>
     </w:p>
     <w:p>
@@ -575,7 +575,7 @@
         <w:pStyle w:val="ListBullet"/>
       </w:pPr>
       <w:r>
-        <w:t>📲 grupo do WhatsApp do curso (grupo fechado com conteúdos novos e bastidores, aberto semanalmente para dúvidas e interações)</w:t>
+        <w:t>📲 Grupo do WhatsApp do curso: valor R$ 47</w:t>
       </w:r>
     </w:p>
     <w:p>
@@ -583,7 +583,7 @@
         <w:pStyle w:val="ListBullet"/>
       </w:pPr>
       <w:r>
-        <w:t>🎟️ desconto nos próximos cursos da Recria</w:t>
+        <w:t>🎁 Bônus surpresa (e-books e materiais complementares em PDF): valor R$ 197</w:t>
       </w:r>
     </w:p>
     <w:p>
@@ -591,7 +591,27 @@
         <w:pStyle w:val="ListBullet"/>
       </w:pPr>
       <w:r>
-        <w:t>⏳ 1 ano de acesso: termina em cerca de 1 mês e ainda tem 11 meses para rever</w:t>
+        <w:t>🎟️ Desconto nos próximos cursos da Recria: valor inestimável</w:t>
+      </w:r>
+    </w:p>
+    <w:p>
+      <w:pPr>
+        <w:pStyle w:val="ListBullet"/>
+      </w:pPr>
+      <w:r>
+        <w:rPr>
+          <w:b/>
+          <w:color w:val="5A4412"/>
+        </w:rPr>
+        <w:t>Total em bônus: R$ 738 + desconto inestimável. Tudo incluso no Recria Ads.</w:t>
+      </w:r>
+    </w:p>
+    <w:p>
+      <w:pPr>
+        <w:pStyle w:val="ListBullet"/>
+      </w:pPr>
+      <w:r>
+        <w:t>Também: 1 ano de acesso (termina em cerca de 1 mês e ainda tem 11 meses para rever)</w:t>
       </w:r>
     </w:p>
     <w:p>

</xml_diff>